<commit_message>
them truong ca nam
</commit_message>
<xml_diff>
--- a/assets/docs/chuyen-chinh/ChuyenChinh-CD.docx
+++ b/assets/docs/chuyen-chinh/ChuyenChinh-CD.docx
@@ -1959,7 +1959,7 @@
           <w:sz w:val="28"/>
           <w:szCs w:val="28"/>
         </w:rPr>
-        <w:t>rèn luyện, tham gia hoạt động phong trào. Kết quả HK</w:t>
+        <w:t xml:space="preserve">rèn luyện, tham gia hoạt động phong trào. Kết quả </w:t>
       </w:r>
       <w:r>
         <w:rPr>
@@ -1983,23 +1983,7 @@
           <w:sz w:val="28"/>
           <w:szCs w:val="28"/>
         </w:rPr>
-        <w:t>}</w:t>
-      </w:r>
-      <w:r>
-        <w:rPr>
-          <w:rFonts w:ascii="Times New Roman" w:hAnsi="Times New Roman"/>
-          <w:sz w:val="28"/>
-          <w:szCs w:val="28"/>
-        </w:rPr>
-        <w:t>/</w:t>
-      </w:r>
-      <w:r>
-        <w:rPr>
-          <w:rFonts w:ascii="Times New Roman" w:hAnsi="Times New Roman"/>
-          <w:sz w:val="28"/>
-          <w:szCs w:val="28"/>
-        </w:rPr>
-        <w:t>{</w:t>
+        <w:t>}{</w:t>
       </w:r>
       <w:r>
         <w:rPr>

</xml_diff>